<commit_message>
Ütemezze a teljes NIS2 akciócsomagot
</commit_message>
<xml_diff>
--- a/portal_materials/DEF-037_lejart_akciok_statusz_es_hatarido_egyeztetese.docx
+++ b/portal_materials/DEF-037_lejart_akciok_statusz_es_hatarido_egyeztetese.docx
@@ -248,7 +248,7 @@
                 <w:color w:val="000000"/>
                 <w:sz w:val="22"/>
               </w:rPr>
-              <w:t>16 lejárt akció; data/deadline_reconciliation.json; DEADLINE_RECONCILIATION_FORM_2026-07-29.md</w:t>
+              <w:t>D-035; data/deadline_reconciliation.json; DEADLINE_RECONCILIATION_FORM_2026-07-29.md</w:t>
             </w:r>
           </w:p>
         </w:tc>
@@ -362,7 +362,7 @@
     </w:p>
     <w:p>
       <w:r>
-        <w:t>A feladathoz szükséges emberi vizsgálat, kapudöntés, mellékletek és jóváhagyási nyom egységes rögzítése. Elkészítendő eredmény: Akciónként tényleges állapotleírás és outcome; reviewer, időzónás review-idő és védett döntési hivatkozás; elkészült tételnél védett evidencia URI/SHA-256 és külön evidencia-review; újraütemezésnél indokolt, jövőbeli céldátum és jogosult jóváhagyás; az elfogadott döntések kézi, preflighttal és utóellenőrzéssel kontrollált átvezetése az actions.csv fájlba.</w:t>
+        <w:t>A feladathoz szükséges emberi vizsgálat, kapudöntés, mellékletek és jóváhagyási nyom egységes rögzítése. Elkészítendő eredmény: A tényleges előrehaladást továbbra is akciónként kell rögzíteni; elkészült tételnél védett evidencia URI/SHA-256, reviewer és döntési hivatkozás szükséges. A jövőben lejáró, nem terminális akciókat az aktuális állapotnapra új egyeztetési körbe kell venni.</w:t>
       </w:r>
     </w:p>
     <w:p>
@@ -375,7 +375,7 @@
     </w:p>
     <w:p>
       <w:r>
-        <w:t>Az A-002 D-031/EV-GOV-001 szerinti lezárása után a 2026-07-29-i állapot szerint 16 nem terminális akció nyilvántartott céldátuma lejárt. Elkészült a snapshot-mezőket védő, proposal-only egyeztetési nyilvántartás és emberi munkalap; minden rekord PENDING_HUMAN. A helyi portál append-only, hitelesítetlen rögzítői státusztervezetet tud fogadni; a hash-ellenőrzött review-, döntési-, változásjavaslati, stale-safe preflight- és pre/post hash utóellenőrzési lánc elkészült. A baseline még 0 tervezetet tartalmaz. Státusz vagy céldátum nem változott.</w:t>
+        <w:t>Történeti megjegyzés: a D-035 előtt a 2026-07-29-i állapotra 16 lejárt, nem terminális akció szerepelt az egyeztetési körben. A D-035 jóváhagyott ütemezési baseline átvezetése után ugyanezen állapotnapra a nyilvántartás újragenerálva 0 rekordos és valid. Ez nem változtatott akcióstátuszt, nem fogadott el evidenciát és nem igazolt tényleges teljesítést.</w:t>
       </w:r>
     </w:p>
     <w:p>
@@ -388,7 +388,7 @@
     </w:p>
     <w:p>
       <w:r>
-        <w:t>Bármely érintett akció státuszának vagy céldátumának módosítása, evidenciaelfogadása vagy lezárása előtt.</w:t>
+        <w:t>Bármely akció evidenciaelfogadása vagy lezárása, illetve a D-035 céldátumainak újabb módosítása előtt.</w:t>
       </w:r>
     </w:p>
     <w:p>
@@ -562,7 +562,7 @@
                 <w:color w:val="000000"/>
                 <w:sz w:val="22"/>
               </w:rPr>
-              <w:t>Akciónként tényleges állapotleírás és outcome</w:t>
+              <w:t>A tényleges előrehaladást továbbra is akciónként kell rögzíteni</w:t>
             </w:r>
           </w:p>
         </w:tc>
@@ -636,229 +636,7 @@
                 <w:color w:val="000000"/>
                 <w:sz w:val="22"/>
               </w:rPr>
-              <w:t>reviewer, időzónás review-idő és védett döntési hivatkozás</w:t>
-            </w:r>
-          </w:p>
-        </w:tc>
-        <w:tc>
-          <w:tcPr>
-            <w:tcW w:type="dxa" w:w="1620"/>
-            <w:vAlign w:val="center"/>
-            <w:tcMar>
-              <w:top w:w="80" w:type="dxa"/>
-              <w:bottom w:w="80" w:type="dxa"/>
-              <w:start w:w="120" w:type="dxa"/>
-              <w:end w:w="120" w:type="dxa"/>
-            </w:tcMar>
-          </w:tcPr>
-          <w:p>
-            <w:r>
-              <w:rPr>
-                <w:rFonts w:ascii="Calibri" w:hAnsi="Calibri"/>
-                <w:b w:val="0"/>
-                <w:color w:val="000000"/>
-                <w:sz w:val="22"/>
-              </w:rPr>
-              <w:t>Igen / N.a.</w:t>
-            </w:r>
-          </w:p>
-        </w:tc>
-        <w:tc>
-          <w:tcPr>
-            <w:tcW w:type="dxa" w:w="1620"/>
-            <w:vAlign w:val="center"/>
-            <w:tcMar>
-              <w:top w:w="80" w:type="dxa"/>
-              <w:bottom w:w="80" w:type="dxa"/>
-              <w:start w:w="120" w:type="dxa"/>
-              <w:end w:w="120" w:type="dxa"/>
-            </w:tcMar>
-          </w:tcPr>
-          <w:p>
-            <w:r>
-              <w:rPr>
-                <w:rFonts w:ascii="Calibri" w:hAnsi="Calibri"/>
-                <w:b w:val="0"/>
-                <w:color w:val="000000"/>
-                <w:sz w:val="22"/>
-              </w:rPr>
-              <w:t>Nem / N.a.</w:t>
-            </w:r>
-          </w:p>
-        </w:tc>
-      </w:tr>
-      <w:tr>
-        <w:trPr>
-          <w:cantSplit/>
-        </w:trPr>
-        <w:tc>
-          <w:tcPr>
-            <w:tcW w:type="dxa" w:w="6120"/>
-            <w:vAlign w:val="center"/>
-            <w:tcMar>
-              <w:top w:w="80" w:type="dxa"/>
-              <w:bottom w:w="80" w:type="dxa"/>
-              <w:start w:w="120" w:type="dxa"/>
-              <w:end w:w="120" w:type="dxa"/>
-            </w:tcMar>
-          </w:tcPr>
-          <w:p>
-            <w:r>
-              <w:rPr>
-                <w:rFonts w:ascii="Calibri" w:hAnsi="Calibri"/>
-                <w:b w:val="0"/>
-                <w:color w:val="000000"/>
-                <w:sz w:val="22"/>
-              </w:rPr>
-              <w:t>elkészült tételnél védett evidencia URI/SHA-256 és külön evidencia-review</w:t>
-            </w:r>
-          </w:p>
-        </w:tc>
-        <w:tc>
-          <w:tcPr>
-            <w:tcW w:type="dxa" w:w="1620"/>
-            <w:vAlign w:val="center"/>
-            <w:tcMar>
-              <w:top w:w="80" w:type="dxa"/>
-              <w:bottom w:w="80" w:type="dxa"/>
-              <w:start w:w="120" w:type="dxa"/>
-              <w:end w:w="120" w:type="dxa"/>
-            </w:tcMar>
-          </w:tcPr>
-          <w:p>
-            <w:r>
-              <w:rPr>
-                <w:rFonts w:ascii="Calibri" w:hAnsi="Calibri"/>
-                <w:b w:val="0"/>
-                <w:color w:val="000000"/>
-                <w:sz w:val="22"/>
-              </w:rPr>
-              <w:t>Igen / N.a.</w:t>
-            </w:r>
-          </w:p>
-        </w:tc>
-        <w:tc>
-          <w:tcPr>
-            <w:tcW w:type="dxa" w:w="1620"/>
-            <w:vAlign w:val="center"/>
-            <w:tcMar>
-              <w:top w:w="80" w:type="dxa"/>
-              <w:bottom w:w="80" w:type="dxa"/>
-              <w:start w:w="120" w:type="dxa"/>
-              <w:end w:w="120" w:type="dxa"/>
-            </w:tcMar>
-          </w:tcPr>
-          <w:p>
-            <w:r>
-              <w:rPr>
-                <w:rFonts w:ascii="Calibri" w:hAnsi="Calibri"/>
-                <w:b w:val="0"/>
-                <w:color w:val="000000"/>
-                <w:sz w:val="22"/>
-              </w:rPr>
-              <w:t>Nem / N.a.</w:t>
-            </w:r>
-          </w:p>
-        </w:tc>
-      </w:tr>
-      <w:tr>
-        <w:trPr>
-          <w:cantSplit/>
-        </w:trPr>
-        <w:tc>
-          <w:tcPr>
-            <w:tcW w:type="dxa" w:w="6120"/>
-            <w:vAlign w:val="center"/>
-            <w:tcMar>
-              <w:top w:w="80" w:type="dxa"/>
-              <w:bottom w:w="80" w:type="dxa"/>
-              <w:start w:w="120" w:type="dxa"/>
-              <w:end w:w="120" w:type="dxa"/>
-            </w:tcMar>
-          </w:tcPr>
-          <w:p>
-            <w:r>
-              <w:rPr>
-                <w:rFonts w:ascii="Calibri" w:hAnsi="Calibri"/>
-                <w:b w:val="0"/>
-                <w:color w:val="000000"/>
-                <w:sz w:val="22"/>
-              </w:rPr>
-              <w:t>újraütemezésnél indokolt, jövőbeli céldátum és jogosult jóváhagyás</w:t>
-            </w:r>
-          </w:p>
-        </w:tc>
-        <w:tc>
-          <w:tcPr>
-            <w:tcW w:type="dxa" w:w="1620"/>
-            <w:vAlign w:val="center"/>
-            <w:tcMar>
-              <w:top w:w="80" w:type="dxa"/>
-              <w:bottom w:w="80" w:type="dxa"/>
-              <w:start w:w="120" w:type="dxa"/>
-              <w:end w:w="120" w:type="dxa"/>
-            </w:tcMar>
-          </w:tcPr>
-          <w:p>
-            <w:r>
-              <w:rPr>
-                <w:rFonts w:ascii="Calibri" w:hAnsi="Calibri"/>
-                <w:b w:val="0"/>
-                <w:color w:val="000000"/>
-                <w:sz w:val="22"/>
-              </w:rPr>
-              <w:t>Igen / N.a.</w:t>
-            </w:r>
-          </w:p>
-        </w:tc>
-        <w:tc>
-          <w:tcPr>
-            <w:tcW w:type="dxa" w:w="1620"/>
-            <w:vAlign w:val="center"/>
-            <w:tcMar>
-              <w:top w:w="80" w:type="dxa"/>
-              <w:bottom w:w="80" w:type="dxa"/>
-              <w:start w:w="120" w:type="dxa"/>
-              <w:end w:w="120" w:type="dxa"/>
-            </w:tcMar>
-          </w:tcPr>
-          <w:p>
-            <w:r>
-              <w:rPr>
-                <w:rFonts w:ascii="Calibri" w:hAnsi="Calibri"/>
-                <w:b w:val="0"/>
-                <w:color w:val="000000"/>
-                <w:sz w:val="22"/>
-              </w:rPr>
-              <w:t>Nem / N.a.</w:t>
-            </w:r>
-          </w:p>
-        </w:tc>
-      </w:tr>
-      <w:tr>
-        <w:trPr>
-          <w:cantSplit/>
-        </w:trPr>
-        <w:tc>
-          <w:tcPr>
-            <w:tcW w:type="dxa" w:w="6120"/>
-            <w:vAlign w:val="center"/>
-            <w:tcMar>
-              <w:top w:w="80" w:type="dxa"/>
-              <w:bottom w:w="80" w:type="dxa"/>
-              <w:start w:w="120" w:type="dxa"/>
-              <w:end w:w="120" w:type="dxa"/>
-            </w:tcMar>
-          </w:tcPr>
-          <w:p>
-            <w:r>
-              <w:rPr>
-                <w:rFonts w:ascii="Calibri" w:hAnsi="Calibri"/>
-                <w:b w:val="0"/>
-                <w:color w:val="000000"/>
-                <w:sz w:val="22"/>
-              </w:rPr>
-              <w:t>az elfogadott döntések kézi, preflighttal és utóellenőrzéssel kontrollált átvezetése az actions.csv fájlba</w:t>
+              <w:t>elkészült tételnél védett evidencia URI/SHA-256, reviewer és döntési hivatkozás szükséges. A jövőben lejáró, nem terminális akciókat az aktuális állapotnapra új egyeztetési körbe kell venni</w:t>
             </w:r>
           </w:p>
         </w:tc>

</xml_diff>